<commit_message>
Auto sync 2026-10-11 21:06:02
</commit_message>
<xml_diff>
--- a/09-设计与原型/17-订单履约时效管理原型/销售计划管理调整会议纪要.docx
+++ b/09-设计与原型/17-订单履约时效管理原型/销售计划管理调整会议纪要.docx
@@ -593,6 +593,11 @@
           <w:color w:val="000000"/>
         </w:rPr>
         <w:t>• 线上周计划最终由丹总确认。</w:t>
+      </w:r>
+    </w:p>
+    <w:p>
+      <w:r>
+        <w:br w:type="page"/>
       </w:r>
     </w:p>
     <w:p>
@@ -1261,11 +1266,6 @@
           <w:color w:val="000000"/>
         </w:rPr>
         <w:t>• 商品范围发生调整时，应保留变更记录。</w:t>
-      </w:r>
-    </w:p>
-    <w:p>
-      <w:r>
-        <w:br w:type="page"/>
       </w:r>
     </w:p>
     <w:p>

</xml_diff>

<commit_message>
Auto sync 2026-10-11 21:08:19
</commit_message>
<xml_diff>
--- a/09-设计与原型/17-订单履约时效管理原型/销售计划管理调整会议纪要.docx
+++ b/09-设计与原型/17-订单履约时效管理原型/销售计划管理调整会议纪要.docx
@@ -1342,6 +1342,11 @@
       </w:r>
     </w:p>
     <w:p>
+      <w:r>
+        <w:br w:type="page"/>
+      </w:r>
+    </w:p>
+    <w:p>
       <w:pPr>
         <w:pStyle w:val="Heading1"/>
       </w:pPr>

</xml_diff>